<commit_message>
Move Joseph art to Chapter 12 and link Canaan's curse to Ham's actions
- Chapter 12 now faces "Joseph Rises in Egypt" (its family-reunion
  panel; the art's original CHAPTER 12 label is now correct). Chapter 10
  faces a Genesis 39:20-21 Scripture Spotlight instead.
- Chapter 5 text states that Noah's curse, spoken because of Ham's
  actions, names Ham's son Canaan. The Chapter 5 art's "What Happened with
  Canaan?" box is relettered to match (it previously said Noah saw
  something wrong and responded in anger).
- Keep the author name as LeTisha C. Cleveland; update the QC report and
  open-issues list.

Co-Authored-By: Claude Opus 5.5 <noreply@anthropic.com>
Claude-Session: https://claude.ai/code/session_01MoWmDNVtH34VN9ywvoYJRo
</commit_message>
<xml_diff>
--- a/deliverables/03_QC_Report.docx
+++ b/deliverables/03_QC_Report.docx
@@ -424,7 +424,7 @@
         <w:t xml:space="preserve"> </w:t>
       </w:r>
       <w:r>
-        <w:t xml:space="preserve">chapter text on the left-hand page, its own picture on the right-hand page. You see both together when the book is open.</w:t>
+        <w:t xml:space="preserve">chapter text on the left-hand page, its own picture on the right-hand page. You see both together when the book is open. The exception is Chapter 10, which faces a Scripture Spotlight page because its picture now illustrates Chapter 12.</w:t>
       </w:r>
     </w:p>
     <w:p>
@@ -3434,7 +3434,25 @@
               <w:t xml:space="preserve">”</w:t>
             </w:r>
             <w:r>
-              <w:t xml:space="preserve">; page number 16 → 13</w:t>
+              <w:t xml:space="preserve">;</w:t>
+            </w:r>
+            <w:r>
+              <w:t xml:space="preserve"> </w:t>
+            </w:r>
+            <w:r>
+              <w:t xml:space="preserve">“</w:t>
+            </w:r>
+            <w:r>
+              <w:t xml:space="preserve">What Happened with Canaan?</w:t>
+            </w:r>
+            <w:r>
+              <w:t xml:space="preserve">”</w:t>
+            </w:r>
+            <w:r>
+              <w:t xml:space="preserve"> </w:t>
+            </w:r>
+            <w:r>
+              <w:t xml:space="preserve">box reworded (see §5); page number 16 → 13</w:t>
             </w:r>
           </w:p>
         </w:tc>
@@ -3720,7 +3738,119 @@
               <w:jc w:val="left"/>
             </w:pPr>
             <w:r>
-              <w:t xml:space="preserve">Ch. 10 text /</w:t>
+              <w:t xml:space="preserve">Ch. 10 text / Scripture Spotlight (Genesis 39:20–21)</w:t>
+            </w:r>
+          </w:p>
+        </w:tc>
+        <w:tc>
+          <w:tcPr/>
+          <w:p>
+            <w:pPr>
+              <w:pStyle w:val="Compact"/>
+              <w:jc w:val="left"/>
+            </w:pPr>
+            <w:r>
+              <w:t xml:space="preserve">Ch. 10’s former picture moved to Ch. 12, as you asked; Ch. 10 has no artwork of its own</w:t>
+            </w:r>
+          </w:p>
+        </w:tc>
+      </w:tr>
+      <w:tr>
+        <w:tc>
+          <w:tcPr/>
+          <w:p>
+            <w:pPr>
+              <w:pStyle w:val="Compact"/>
+              <w:jc w:val="left"/>
+            </w:pPr>
+            <w:r>
+              <w:t xml:space="preserve">24 / 25</w:t>
+            </w:r>
+          </w:p>
+        </w:tc>
+        <w:tc>
+          <w:tcPr/>
+          <w:p>
+            <w:pPr>
+              <w:pStyle w:val="Compact"/>
+              <w:jc w:val="left"/>
+            </w:pPr>
+            <w:r>
+              <w:t xml:space="preserve">L / R</w:t>
+            </w:r>
+          </w:p>
+        </w:tc>
+        <w:tc>
+          <w:tcPr/>
+          <w:p>
+            <w:pPr>
+              <w:pStyle w:val="Compact"/>
+              <w:jc w:val="left"/>
+            </w:pPr>
+            <w:r>
+              <w:t xml:space="preserve">Ch. 11 text /</w:t>
+            </w:r>
+            <w:r>
+              <w:t xml:space="preserve"> </w:t>
+            </w:r>
+            <w:r>
+              <w:t xml:space="preserve">“</w:t>
+            </w:r>
+            <w:r>
+              <w:t xml:space="preserve">Joseph Rises to Power</w:t>
+            </w:r>
+            <w:r>
+              <w:t xml:space="preserve">”</w:t>
+            </w:r>
+          </w:p>
+        </w:tc>
+        <w:tc>
+          <w:tcPr/>
+          <w:p>
+            <w:pPr>
+              <w:pStyle w:val="Compact"/>
+              <w:jc w:val="left"/>
+            </w:pPr>
+            <w:r>
+              <w:t xml:space="preserve">CHAPTER 15 → 11; page number 23 → 25</w:t>
+            </w:r>
+          </w:p>
+        </w:tc>
+      </w:tr>
+      <w:tr>
+        <w:tc>
+          <w:tcPr/>
+          <w:p>
+            <w:pPr>
+              <w:pStyle w:val="Compact"/>
+              <w:jc w:val="left"/>
+            </w:pPr>
+            <w:r>
+              <w:t xml:space="preserve">26 / 27</w:t>
+            </w:r>
+          </w:p>
+        </w:tc>
+        <w:tc>
+          <w:tcPr/>
+          <w:p>
+            <w:pPr>
+              <w:pStyle w:val="Compact"/>
+              <w:jc w:val="left"/>
+            </w:pPr>
+            <w:r>
+              <w:t xml:space="preserve">L / R</w:t>
+            </w:r>
+          </w:p>
+        </w:tc>
+        <w:tc>
+          <w:tcPr/>
+          <w:p>
+            <w:pPr>
+              <w:pStyle w:val="Compact"/>
+              <w:jc w:val="left"/>
+            </w:pPr>
+            <w:r>
+              <w:t xml:space="preserve">Ch. 12 text /</w:t>
             </w:r>
             <w:r>
               <w:t xml:space="preserve"> </w:t>
@@ -3744,119 +3874,43 @@
               <w:jc w:val="left"/>
             </w:pPr>
             <w:r>
-              <w:t xml:space="preserve">CHAPTER 12 → 10; page number 20 → 23</w:t>
-            </w:r>
-          </w:p>
-        </w:tc>
-      </w:tr>
-      <w:tr>
-        <w:tc>
-          <w:tcPr/>
-          <w:p>
-            <w:pPr>
-              <w:pStyle w:val="Compact"/>
-              <w:jc w:val="left"/>
-            </w:pPr>
-            <w:r>
-              <w:t xml:space="preserve">24 / 25</w:t>
-            </w:r>
-          </w:p>
-        </w:tc>
-        <w:tc>
-          <w:tcPr/>
-          <w:p>
-            <w:pPr>
-              <w:pStyle w:val="Compact"/>
-              <w:jc w:val="left"/>
-            </w:pPr>
-            <w:r>
-              <w:t xml:space="preserve">L / R</w:t>
-            </w:r>
-          </w:p>
-        </w:tc>
-        <w:tc>
-          <w:tcPr/>
-          <w:p>
-            <w:pPr>
-              <w:pStyle w:val="Compact"/>
-              <w:jc w:val="left"/>
-            </w:pPr>
-            <w:r>
-              <w:t xml:space="preserve">Ch. 11 text /</w:t>
-            </w:r>
-            <w:r>
-              <w:t xml:space="preserve"> </w:t>
-            </w:r>
-            <w:r>
-              <w:t xml:space="preserve">“</w:t>
-            </w:r>
-            <w:r>
-              <w:t xml:space="preserve">Joseph Rises to Power</w:t>
-            </w:r>
-            <w:r>
-              <w:t xml:space="preserve">”</w:t>
-            </w:r>
-          </w:p>
-        </w:tc>
-        <w:tc>
-          <w:tcPr/>
-          <w:p>
-            <w:pPr>
-              <w:pStyle w:val="Compact"/>
-              <w:jc w:val="left"/>
-            </w:pPr>
-            <w:r>
-              <w:t xml:space="preserve">CHAPTER 15 → 11; page number 23 → 25</w:t>
-            </w:r>
-          </w:p>
-        </w:tc>
-      </w:tr>
-      <w:tr>
-        <w:tc>
-          <w:tcPr/>
-          <w:p>
-            <w:pPr>
-              <w:pStyle w:val="Compact"/>
-              <w:jc w:val="left"/>
-            </w:pPr>
-            <w:r>
-              <w:t xml:space="preserve">26 / 27</w:t>
-            </w:r>
-          </w:p>
-        </w:tc>
-        <w:tc>
-          <w:tcPr/>
-          <w:p>
-            <w:pPr>
-              <w:pStyle w:val="Compact"/>
-              <w:jc w:val="left"/>
-            </w:pPr>
-            <w:r>
-              <w:t xml:space="preserve">L / R</w:t>
-            </w:r>
-          </w:p>
-        </w:tc>
-        <w:tc>
-          <w:tcPr/>
-          <w:p>
-            <w:pPr>
-              <w:pStyle w:val="Compact"/>
-              <w:jc w:val="left"/>
-            </w:pPr>
-            <w:r>
-              <w:t xml:space="preserve">Ch. 12 text / Scripture Spotlight (Genesis 50:20)</w:t>
-            </w:r>
-          </w:p>
-        </w:tc>
-        <w:tc>
-          <w:tcPr/>
-          <w:p>
-            <w:pPr>
-              <w:pStyle w:val="Compact"/>
-              <w:jc w:val="left"/>
-            </w:pPr>
-            <w:r>
-              <w:t xml:space="preserve">Ch. 12 has no art (see Open Issues #3)</w:t>
+              <w:t xml:space="preserve">Its original label</w:t>
+            </w:r>
+            <w:r>
+              <w:t xml:space="preserve"> </w:t>
+            </w:r>
+            <w:r>
+              <w:t xml:space="preserve">“</w:t>
+            </w:r>
+            <w:r>
+              <w:t xml:space="preserve">CHAPTER 12</w:t>
+            </w:r>
+            <w:r>
+              <w:t xml:space="preserve">”</w:t>
+            </w:r>
+            <w:r>
+              <w:t xml:space="preserve"> </w:t>
+            </w:r>
+            <w:r>
+              <w:t xml:space="preserve">is now correct; page number 20 → 27; its</w:t>
+            </w:r>
+            <w:r>
+              <w:t xml:space="preserve"> </w:t>
+            </w:r>
+            <w:r>
+              <w:t xml:space="preserve">“</w:t>
+            </w:r>
+            <w:r>
+              <w:t xml:space="preserve">A Greater Purpose</w:t>
+            </w:r>
+            <w:r>
+              <w:t xml:space="preserve">”</w:t>
+            </w:r>
+            <w:r>
+              <w:t xml:space="preserve"> </w:t>
+            </w:r>
+            <w:r>
+              <w:t xml:space="preserve">panel shows the family reunion</w:t>
             </w:r>
           </w:p>
         </w:tc>
@@ -4209,7 +4263,64 @@
         <w:pStyle w:val="Compact"/>
       </w:pPr>
       <w:r>
-        <w:t xml:space="preserve">10 chapter/series labels, 13 page numbers and 1 Scripture misprint.</w:t>
+        <w:t xml:space="preserve">9 chapter/series labels, 13 page numbers and 1 Scripture misprint.</w:t>
+      </w:r>
+    </w:p>
+    <w:p>
+      <w:pPr>
+        <w:numPr>
+          <w:ilvl w:val="1"/>
+          <w:numId w:val="1007"/>
+        </w:numPr>
+        <w:pStyle w:val="Compact"/>
+      </w:pPr>
+      <w:r>
+        <w:t xml:space="preserve">The first paragraph of the Chapter 5</w:t>
+      </w:r>
+      <w:r>
+        <w:t xml:space="preserve"> </w:t>
+      </w:r>
+      <w:r>
+        <w:t xml:space="preserve">“</w:t>
+      </w:r>
+      <w:r>
+        <w:t xml:space="preserve">What Happened with Canaan?</w:t>
+      </w:r>
+      <w:r>
+        <w:t xml:space="preserve">”</w:t>
+      </w:r>
+      <w:r>
+        <w:t xml:space="preserve"> </w:t>
+      </w:r>
+      <w:r>
+        <w:t xml:space="preserve">box. It wrongly said</w:t>
+      </w:r>
+      <w:r>
+        <w:t xml:space="preserve"> </w:t>
+      </w:r>
+      <w:r>
+        <w:t xml:space="preserve">“</w:t>
+      </w:r>
+      <w:r>
+        <w:t xml:space="preserve">Noah saw something wrong and responded in anger</w:t>
+      </w:r>
+      <w:r>
+        <w:t xml:space="preserve">”</w:t>
+      </w:r>
+      <w:r>
+        <w:t xml:space="preserve">. It now reads:</w:t>
+      </w:r>
+      <w:r>
+        <w:t xml:space="preserve"> </w:t>
+      </w:r>
+      <w:r>
+        <w:t xml:space="preserve">“</w:t>
+      </w:r>
+      <w:r>
+        <w:t xml:space="preserve">In Genesis 9, Ham saw his father uncovered and told his brothers. Because of Ham’s actions, Noah cursed Ham’s son, Canaan:</w:t>
+      </w:r>
+      <w:r>
+        <w:t xml:space="preserve">”</w:t>
       </w:r>
     </w:p>
     <w:p>
@@ -4857,6 +4968,72 @@
               <w:jc w:val="left"/>
             </w:pPr>
             <w:r>
+              <w:rPr>
+                <w:bCs/>
+                <w:b/>
+              </w:rPr>
+              <w:t xml:space="preserve">Links the curse to Ham’s actions (you requested it):</w:t>
+            </w:r>
+            <w:r>
+              <w:t xml:space="preserve"> </w:t>
+            </w:r>
+            <w:r>
+              <w:t xml:space="preserve">“</w:t>
+            </w:r>
+            <w:r>
+              <w:t xml:space="preserve">Because of Ham’s actions, Noah spoke a curse—but the words recorded in Genesis 9:25 name Ham’s son:</w:t>
+            </w:r>
+            <w:r>
+              <w:t xml:space="preserve"> </w:t>
+            </w:r>
+            <w:r>
+              <w:t xml:space="preserve">‘</w:t>
+            </w:r>
+            <w:r>
+              <w:t xml:space="preserve">Cursed be Canaan…</w:t>
+            </w:r>
+            <w:r>
+              <w:t xml:space="preserve">’</w:t>
+            </w:r>
+            <w:r>
+              <w:t xml:space="preserve">”</w:t>
+            </w:r>
+          </w:p>
+        </w:tc>
+        <w:tc>
+          <w:tcPr/>
+          <w:p>
+            <w:pPr>
+              <w:pStyle w:val="Compact"/>
+              <w:jc w:val="left"/>
+            </w:pPr>
+            <w:r>
+              <w:t xml:space="preserve">Makes clear why Canaan was named</w:t>
+            </w:r>
+          </w:p>
+        </w:tc>
+      </w:tr>
+      <w:tr>
+        <w:tc>
+          <w:tcPr/>
+          <w:p>
+            <w:pPr>
+              <w:pStyle w:val="Compact"/>
+              <w:jc w:val="left"/>
+            </w:pPr>
+            <w:r>
+              <w:t xml:space="preserve">5</w:t>
+            </w:r>
+          </w:p>
+        </w:tc>
+        <w:tc>
+          <w:tcPr/>
+          <w:p>
+            <w:pPr>
+              <w:pStyle w:val="Compact"/>
+              <w:jc w:val="left"/>
+            </w:pPr>
+            <w:r>
               <w:t xml:space="preserve">Added</w:t>
             </w:r>
             <w:r>
@@ -5569,7 +5746,7 @@
         <w:t xml:space="preserve"> </w:t>
       </w:r>
       <w:r>
-        <w:t xml:space="preserve">- Exodus 1:8. The quotations of Genesis 6:9 and Exodus 1:8 match the NIV word for word.</w:t>
+        <w:t xml:space="preserve">- Exodus 1:8. The quotations of Genesis 6:9, Genesis 39:20–21 and Exodus 1:8 match the NIV word for word.</w:t>
       </w:r>
     </w:p>
     <w:p>
@@ -5813,7 +5990,7 @@
               <w:jc w:val="left"/>
             </w:pPr>
             <w:r>
-              <w:t xml:space="preserve">✅ All 3,001 words checked by position. The closest is 0.54 in from the trim (KDP minimum 0.375 in). All pictures are ≥ 0.45 in inside the trim.</w:t>
+              <w:t xml:space="preserve">✅ All 3,017 words checked by position. The closest is 0.54 in from the trim (KDP minimum 0.375 in). All pictures are ≥ 0.45 in inside the trim.</w:t>
             </w:r>
           </w:p>
         </w:tc>
@@ -6191,7 +6368,7 @@
           <w:bCs/>
           <w:b/>
         </w:rPr>
-        <w:t xml:space="preserve">Your exact author name, and the Open Issues items below.</w:t>
+        <w:t xml:space="preserve">The Open Issues items.</w:t>
       </w:r>
       <w:r>
         <w:t xml:space="preserve"> </w:t>

</xml_diff>

<commit_message>
Correct "Pharaoh's house" to "Potiphar's house" in Chapter 12 art
The "A Faithful Servant" panel said Joseph worked in Pharaoh's house;
Genesis 39 places him in the house of Potiphar, Pharaoh's official. The
panel's three lines were relettered together (Liberation Serif, a
Times-metric face matching the art). Reports updated; the author has
confirmed no higher-resolution artwork is available.

Co-Authored-By: Claude Opus 5.5 <noreply@anthropic.com>
Claude-Session: https://claude.ai/code/session_01MoWmDNVtH34VN9ywvoYJRo
</commit_message>
<xml_diff>
--- a/deliverables/03_QC_Report.docx
+++ b/deliverables/03_QC_Report.docx
@@ -3910,7 +3910,37 @@
               <w:t xml:space="preserve"> </w:t>
             </w:r>
             <w:r>
-              <w:t xml:space="preserve">panel shows the family reunion</w:t>
+              <w:t xml:space="preserve">panel shows the family reunion;</w:t>
+            </w:r>
+            <w:r>
+              <w:t xml:space="preserve"> </w:t>
+            </w:r>
+            <w:r>
+              <w:t xml:space="preserve">“</w:t>
+            </w:r>
+            <w:r>
+              <w:t xml:space="preserve">Pharaoh’s house</w:t>
+            </w:r>
+            <w:r>
+              <w:t xml:space="preserve">”</w:t>
+            </w:r>
+            <w:r>
+              <w:t xml:space="preserve"> </w:t>
+            </w:r>
+            <w:r>
+              <w:t xml:space="preserve">→</w:t>
+            </w:r>
+            <w:r>
+              <w:t xml:space="preserve"> </w:t>
+            </w:r>
+            <w:r>
+              <w:t xml:space="preserve">“</w:t>
+            </w:r>
+            <w:r>
+              <w:t xml:space="preserve">Potiphar’s house</w:t>
+            </w:r>
+            <w:r>
+              <w:t xml:space="preserve">”</w:t>
             </w:r>
           </w:p>
         </w:tc>
@@ -4264,6 +4294,72 @@
       </w:pPr>
       <w:r>
         <w:t xml:space="preserve">9 chapter/series labels, 13 page numbers and 1 Scripture misprint.</w:t>
+      </w:r>
+    </w:p>
+    <w:p>
+      <w:pPr>
+        <w:numPr>
+          <w:ilvl w:val="1"/>
+          <w:numId w:val="1007"/>
+        </w:numPr>
+        <w:pStyle w:val="Compact"/>
+      </w:pPr>
+      <w:r>
+        <w:t xml:space="preserve">The Chapter 12</w:t>
+      </w:r>
+      <w:r>
+        <w:t xml:space="preserve"> </w:t>
+      </w:r>
+      <w:r>
+        <w:t xml:space="preserve">“</w:t>
+      </w:r>
+      <w:r>
+        <w:t xml:space="preserve">A Faithful Servant</w:t>
+      </w:r>
+      <w:r>
+        <w:t xml:space="preserve">”</w:t>
+      </w:r>
+      <w:r>
+        <w:t xml:space="preserve"> </w:t>
+      </w:r>
+      <w:r>
+        <w:t xml:space="preserve">panel:</w:t>
+      </w:r>
+      <w:r>
+        <w:t xml:space="preserve"> </w:t>
+      </w:r>
+      <w:r>
+        <w:t xml:space="preserve">“</w:t>
+      </w:r>
+      <w:r>
+        <w:t xml:space="preserve">Pharaoh’s house</w:t>
+      </w:r>
+      <w:r>
+        <w:t xml:space="preserve">”</w:t>
+      </w:r>
+      <w:r>
+        <w:t xml:space="preserve"> </w:t>
+      </w:r>
+      <w:r>
+        <w:t xml:space="preserve">→</w:t>
+      </w:r>
+      <w:r>
+        <w:t xml:space="preserve"> </w:t>
+      </w:r>
+      <w:r>
+        <w:t xml:space="preserve">“</w:t>
+      </w:r>
+      <w:r>
+        <w:t xml:space="preserve">Potiphar’s house</w:t>
+      </w:r>
+      <w:r>
+        <w:t xml:space="preserve">”</w:t>
+      </w:r>
+      <w:r>
+        <w:t xml:space="preserve"> </w:t>
+      </w:r>
+      <w:r>
+        <w:t xml:space="preserve">(Genesis 39:1–4). All three lines were relettered together.</w:t>
       </w:r>
     </w:p>
     <w:p>

</xml_diff>

<commit_message>
Clarify Ham's sons in Africa, add today's map for Canaan, fix Ch6/Ch9 art
- Chapter 4 text explains Put and states that Cush, Mizraim, and Put are
  linked with Africa while Canaan's family settled in Canaan; adds an
  "On Today's Map" box (Sudan/southern Egypt, Egypt, Libya; Israel, the
  Palestinian territories, Lebanon, and parts of Syria and Jordan).
- Chapter 4 art: Canaan panel names today's countries (also removes
  garbled strike-through marks in the original art).
- Chapter 6 art: "Ham's descendants built great nations in Africa" now
  names the families of Cush, Mizraim, and Put.
- Chapter 9 art: replace a summary sentence miscited as Genesis 37:28, 36
  with Genesis 50:20.
- Relettering fill now widens its sampling radius for dense text blocks.

Co-Authored-By: Claude Opus 5.5 <noreply@anthropic.com>
Claude-Session: https://claude.ai/code/session_01MoWmDNVtH34VN9ywvoYJRo
</commit_message>
<xml_diff>
--- a/deliverables/03_QC_Report.docx
+++ b/deliverables/03_QC_Report.docx
@@ -3345,7 +3345,7 @@
               <w:t xml:space="preserve">CHAPTER 7 → CHAPTER 4</w:t>
             </w:r>
             <w:r>
-              <w:t xml:space="preserve">; page number 14 → 11</w:t>
+              <w:t xml:space="preserve">; page number 14 → 11; Canaan panel now names today’s countries</w:t>
             </w:r>
           </w:p>
         </w:tc>
@@ -3514,7 +3514,7 @@
               <w:jc w:val="left"/>
             </w:pPr>
             <w:r>
-              <w:t xml:space="preserve">CHAPTER 8 → 6</w:t>
+              <w:t xml:space="preserve">CHAPTER 8 → 6; first sentence names Cush, Mizraim, and Put</w:t>
             </w:r>
           </w:p>
         </w:tc>
@@ -3700,7 +3700,7 @@
               <w:jc w:val="left"/>
             </w:pPr>
             <w:r>
-              <w:t xml:space="preserve">CHAPTER 11 → 9; page number 19 → 21</w:t>
+              <w:t xml:space="preserve">CHAPTER 11 → 9; page number 19 → 21; quotation box → Genesis 50:20</w:t>
             </w:r>
           </w:p>
         </w:tc>
@@ -4294,6 +4294,144 @@
       </w:pPr>
       <w:r>
         <w:t xml:space="preserve">9 chapter/series labels, 13 page numbers and 1 Scripture misprint.</w:t>
+      </w:r>
+    </w:p>
+    <w:p>
+      <w:pPr>
+        <w:numPr>
+          <w:ilvl w:val="1"/>
+          <w:numId w:val="1007"/>
+        </w:numPr>
+        <w:pStyle w:val="Compact"/>
+      </w:pPr>
+      <w:r>
+        <w:t xml:space="preserve">Chapter 4 Canaan panel:</w:t>
+      </w:r>
+      <w:r>
+        <w:t xml:space="preserve"> </w:t>
+      </w:r>
+      <w:r>
+        <w:t xml:space="preserve">“</w:t>
+      </w:r>
+      <w:r>
+        <w:t xml:space="preserve">(Levant region)</w:t>
+      </w:r>
+      <w:r>
+        <w:t xml:space="preserve">”</w:t>
+      </w:r>
+      <w:r>
+        <w:t xml:space="preserve"> </w:t>
+      </w:r>
+      <w:r>
+        <w:t xml:space="preserve">→</w:t>
+      </w:r>
+      <w:r>
+        <w:t xml:space="preserve"> </w:t>
+      </w:r>
+      <w:r>
+        <w:t xml:space="preserve">“</w:t>
+      </w:r>
+      <w:r>
+        <w:t xml:space="preserve">(today: Israel, Palestine, Lebanon, and parts of Syria and Jordan)</w:t>
+      </w:r>
+      <w:r>
+        <w:t xml:space="preserve">”</w:t>
+      </w:r>
+      <w:r>
+        <w:t xml:space="preserve">. This also cleaned up garbled strike-through marks.</w:t>
+      </w:r>
+    </w:p>
+    <w:p>
+      <w:pPr>
+        <w:numPr>
+          <w:ilvl w:val="1"/>
+          <w:numId w:val="1007"/>
+        </w:numPr>
+        <w:pStyle w:val="Compact"/>
+      </w:pPr>
+      <w:r>
+        <w:t xml:space="preserve">Chapter 6 paragraph:</w:t>
+      </w:r>
+      <w:r>
+        <w:t xml:space="preserve"> </w:t>
+      </w:r>
+      <w:r>
+        <w:t xml:space="preserve">“</w:t>
+      </w:r>
+      <w:r>
+        <w:t xml:space="preserve">After the flood, Ham’s descendants built great nations in Africa</w:t>
+      </w:r>
+      <w:r>
+        <w:t xml:space="preserve">”</w:t>
+      </w:r>
+      <w:r>
+        <w:t xml:space="preserve"> </w:t>
+      </w:r>
+      <w:r>
+        <w:t xml:space="preserve">→</w:t>
+      </w:r>
+      <w:r>
+        <w:t xml:space="preserve"> </w:t>
+      </w:r>
+      <w:r>
+        <w:t xml:space="preserve">“</w:t>
+      </w:r>
+      <w:r>
+        <w:t xml:space="preserve">After the flood, the families of Ham’s sons Cush, Mizraim, and Put built great nations in Africa</w:t>
+      </w:r>
+      <w:r>
+        <w:t xml:space="preserve">”</w:t>
+      </w:r>
+      <w:r>
+        <w:t xml:space="preserve">.</w:t>
+      </w:r>
+    </w:p>
+    <w:p>
+      <w:pPr>
+        <w:numPr>
+          <w:ilvl w:val="1"/>
+          <w:numId w:val="1007"/>
+        </w:numPr>
+        <w:pStyle w:val="Compact"/>
+      </w:pPr>
+      <w:r>
+        <w:t xml:space="preserve">Chapter 9 quotation box: a summary sentence wrongly cited as</w:t>
+      </w:r>
+      <w:r>
+        <w:t xml:space="preserve"> </w:t>
+      </w:r>
+      <w:r>
+        <w:t xml:space="preserve">“</w:t>
+      </w:r>
+      <w:r>
+        <w:t xml:space="preserve">Genesis 37:28, 36</w:t>
+      </w:r>
+      <w:r>
+        <w:t xml:space="preserve">”</w:t>
+      </w:r>
+      <w:r>
+        <w:t xml:space="preserve"> </w:t>
+      </w:r>
+      <w:r>
+        <w:t xml:space="preserve">→ Joseph’s actual words,</w:t>
+      </w:r>
+      <w:r>
+        <w:t xml:space="preserve"> </w:t>
+      </w:r>
+      <w:r>
+        <w:t xml:space="preserve">“</w:t>
+      </w:r>
+      <w:r>
+        <w:t xml:space="preserve">You intended to harm me, but God intended it for good.</w:t>
+      </w:r>
+      <w:r>
+        <w:t xml:space="preserve">”</w:t>
+      </w:r>
+      <w:r>
+        <w:t xml:space="preserve"> </w:t>
+      </w:r>
+      <w:r>
+        <w:t xml:space="preserve">(Genesis 50:20).</w:t>
       </w:r>
     </w:p>
     <w:p>
@@ -5052,6 +5190,72 @@
               <w:jc w:val="left"/>
             </w:pPr>
             <w:r>
+              <w:t xml:space="preserve">4</w:t>
+            </w:r>
+          </w:p>
+        </w:tc>
+        <w:tc>
+          <w:tcPr/>
+          <w:p>
+            <w:pPr>
+              <w:pStyle w:val="Compact"/>
+              <w:jc w:val="left"/>
+            </w:pPr>
+            <w:r>
+              <w:rPr>
+                <w:bCs/>
+                <w:b/>
+              </w:rPr>
+              <w:t xml:space="preserve">NEW (you requested it):</w:t>
+            </w:r>
+            <w:r>
+              <w:t xml:space="preserve"> </w:t>
+            </w:r>
+            <w:r>
+              <w:t xml:space="preserve">explains Put; states that Cush, Mizraim, and Put are linked with Africa while Canaan’s family settled in Canaan; adds an</w:t>
+            </w:r>
+            <w:r>
+              <w:t xml:space="preserve"> </w:t>
+            </w:r>
+            <w:r>
+              <w:t xml:space="preserve">“</w:t>
+            </w:r>
+            <w:r>
+              <w:t xml:space="preserve">On Today’s Map</w:t>
+            </w:r>
+            <w:r>
+              <w:t xml:space="preserve">”</w:t>
+            </w:r>
+            <w:r>
+              <w:t xml:space="preserve"> </w:t>
+            </w:r>
+            <w:r>
+              <w:t xml:space="preserve">box (Sudan and southern Egypt, Egypt, Libya; Israel, the Palestinian territories, Lebanon, and parts of Syria and Jordan)</w:t>
+            </w:r>
+          </w:p>
+        </w:tc>
+        <w:tc>
+          <w:tcPr/>
+          <w:p>
+            <w:pPr>
+              <w:pStyle w:val="Compact"/>
+              <w:jc w:val="left"/>
+            </w:pPr>
+            <w:r>
+              <w:t xml:space="preserve">Readers can find the places on a modern map</w:t>
+            </w:r>
+          </w:p>
+        </w:tc>
+      </w:tr>
+      <w:tr>
+        <w:tc>
+          <w:tcPr/>
+          <w:p>
+            <w:pPr>
+              <w:pStyle w:val="Compact"/>
+              <w:jc w:val="left"/>
+            </w:pPr>
+            <w:r>
               <w:t xml:space="preserve">5</w:t>
             </w:r>
           </w:p>
@@ -6086,7 +6290,7 @@
               <w:jc w:val="left"/>
             </w:pPr>
             <w:r>
-              <w:t xml:space="preserve">✅ All 3,017 words checked by position. The closest is 0.54 in from the trim (KDP minimum 0.375 in). All pictures are ≥ 0.45 in inside the trim.</w:t>
+              <w:t xml:space="preserve">✅ All 3,085 words checked by position. The closest is 0.54 in from the trim (KDP minimum 0.375 in). All pictures are ≥ 0.45 in inside the trim.</w:t>
             </w:r>
           </w:p>
         </w:tc>

</xml_diff>